<commit_message>
Kim12-1-9-Korozyon: gorsel alanlarina Shutter onizlemeleri yerlestirildi (2.3 bicimi)
</commit_message>
<xml_diff>
--- a/Kim12-1-9-Korozyon.docx
+++ b/Kim12-1-9-Korozyon.docx
@@ -39,99 +39,73 @@
         <w:t xml:space="preserve">Müzelerde sergilenen tarihî toplar, kılıçlar ve demir kapılar yüzyıllar içinde paslanarak kırmızımsı kahverengi bir tabakayla kaplanmıştır (Görsel A). Açık havadaki bronz heykellerin ve bakır kubbelerin yüzeyi ise zamanla yeşile döner (Görsel B). Benzer değişimler deniz kenarındaki korkuluklarda, eski otomobillerin kasalarında ve bahçede unutulan aletlerde de görülür. Bu değişimler, ortak kültürel mirasımız olan eserlerin ve her gün kullandığımız araç gereçlerin zarar görmesine yol açar. Metaller çevreleriyle nasıl bir etkileşime girerek aşınır? Neden bazı metaller deniz kenarında daha hızlı bozulur? Tarihî eserleri ve metal eşyaları bu bozulmadan nasıl koruyabiliriz?</w:t>
       </w:r>
     </w:p>
-    <w:tbl>
-      <w:tblPr>
-        <w:tblW w:w="9000" w:type="dxa"/>
+    <w:p>
+      <w:pPr>
         <w:jc w:val="center"/>
-        <w:tblBorders>
-          <w:top w:val="single" w:sz="8" w:space="0" w:color="7F7F7F"/>
-          <w:left w:val="single" w:sz="8" w:space="0" w:color="7F7F7F"/>
-          <w:bottom w:val="single" w:sz="8" w:space="0" w:color="7F7F7F"/>
-          <w:right w:val="single" w:sz="8" w:space="0" w:color="7F7F7F"/>
-        </w:tblBorders>
-      </w:tblPr>
-      <w:tblGrid>
-        <w:gridCol w:w="9000"/>
-      </w:tblGrid>
-      <w:tr>
-        <w:tc>
-          <w:tcPr>
-            <w:tcW w:w="9000" w:type="dxa"/>
-            <w:shd w:val="clear" w:color="auto" w:fill="EDEDED"/>
-          </w:tcPr>
-          <w:p>
-            <w:pPr>
-              <w:jc w:val="both"/>
-              <w:rPr>
-                <w:rFonts w:ascii="Times New Roman" w:hAnsi="Times New Roman" w:cs="Times New Roman"/>
-                <w:lang w:val="tr-TR"/>
-              </w:rPr>
-            </w:pPr>
-            <w:r>
-              <w:rPr>
-                <w:rFonts w:ascii="Times New Roman" w:hAnsi="Times New Roman" w:cs="Times New Roman"/>
-                <w:lang w:val="tr-TR"/>
-              </w:rPr>
-              <w:t xml:space="preserve">GÖRSEL ALANI (Shutterstock)</w:t>
-            </w:r>
-          </w:p>
-          <w:p>
-            <w:pPr>
-              <w:jc w:val="both"/>
-              <w:rPr>
-                <w:rFonts w:ascii="Times New Roman" w:hAnsi="Times New Roman" w:cs="Times New Roman"/>
-                <w:lang w:val="tr-TR"/>
-              </w:rPr>
-            </w:pPr>
-            <w:r>
-              <w:rPr>
-                <w:rFonts w:ascii="Times New Roman" w:hAnsi="Times New Roman" w:cs="Times New Roman"/>
-                <w:lang w:val="tr-TR"/>
-              </w:rPr>
-              <w:t xml:space="preserve">Tarif: Açık havada sergilenen, yüzeyi kırmızımsı kahverengi pasla kaplanmış eski bir demir top; tabela ya da yazı görünmesin.</w:t>
-            </w:r>
-          </w:p>
-          <w:p>
-            <w:pPr>
-              <w:jc w:val="both"/>
-              <w:rPr>
-                <w:rFonts w:ascii="Times New Roman" w:hAnsi="Times New Roman" w:cs="Times New Roman"/>
-                <w:lang w:val="tr-TR"/>
-              </w:rPr>
-            </w:pPr>
-            <w:r>
-              <w:rPr>
-                <w:rFonts w:ascii="Times New Roman" w:hAnsi="Times New Roman" w:cs="Times New Roman"/>
-                <w:lang w:val="tr-TR"/>
-              </w:rPr>
-              <w:t xml:space="preserve">Shutter ID: 4207175651 (fotoğraf) — Old rusty iron cannon</w:t>
-            </w:r>
-          </w:p>
-        </w:tc>
-      </w:tr>
-    </w:tbl>
-    <w:p>
-      <w:pPr>
-        <w:jc w:val="both"/>
-        <w:rPr>
-          <w:rFonts w:ascii="Times New Roman" w:hAnsi="Times New Roman" w:cs="Times New Roman"/>
-          <w:lang w:val="tr-TR"/>
-        </w:rPr>
-      </w:pPr>
+      </w:pPr>
+      <w:r>
+        <w:drawing>
+          <wp:inline xmlns:a="http://schemas.openxmlformats.org/drawingml/2006/main" xmlns:pic="http://schemas.openxmlformats.org/drawingml/2006/picture">
+            <wp:extent cx="3467889" cy="2519999"/>
+            <wp:docPr id="900012" name="Picture 900012"/>
+            <wp:cNvGraphicFramePr>
+              <a:graphicFrameLocks noChangeAspect="1"/>
+            </wp:cNvGraphicFramePr>
+            <a:graphic>
+              <a:graphicData uri="http://schemas.openxmlformats.org/drawingml/2006/picture">
+                <pic:pic>
+                  <pic:nvPicPr>
+                    <pic:cNvPr id="0" name="4207175651_d.jpg"/>
+                    <pic:cNvPicPr/>
+                  </pic:nvPicPr>
+                  <pic:blipFill>
+                    <a:blip r:embed="rId11"/>
+                    <a:stretch>
+                      <a:fillRect/>
+                    </a:stretch>
+                  </pic:blipFill>
+                  <pic:spPr>
+                    <a:xfrm>
+                      <a:off x="0" y="0"/>
+                      <a:ext cx="3467889" cy="2519999"/>
+                    </a:xfrm>
+                    <a:prstGeom prst="rect"/>
+                  </pic:spPr>
+                </pic:pic>
+              </a:graphicData>
+            </a:graphic>
+          </wp:inline>
+        </w:drawing>
+      </w:r>
     </w:p>
     <w:p>
       <w:pPr>
         <w:jc w:val="center"/>
-        <w:rPr>
-          <w:rFonts w:ascii="Times New Roman" w:hAnsi="Times New Roman" w:cs="Times New Roman"/>
-          <w:lang w:val="tr-TR"/>
-        </w:rPr>
       </w:pPr>
       <w:r>
         <w:rPr>
           <w:rFonts w:ascii="Times New Roman" w:hAnsi="Times New Roman" w:cs="Times New Roman"/>
           <w:b/>
           <w:bCs/>
+          <w:highlight w:val="yellow"/>
+          <w:lang w:val="tr-TR"/>
+        </w:rPr>
+        <w:t xml:space="preserve">Shutter id: 4207175651</w:t>
+      </w:r>
+    </w:p>
+    <w:p>
+      <w:pPr>
+        <w:jc w:val="center"/>
+        <w:rPr>
+          <w:rFonts w:ascii="Times New Roman" w:hAnsi="Times New Roman" w:cs="Times New Roman"/>
+          <w:lang w:val="tr-TR"/>
+        </w:rPr>
+      </w:pPr>
+      <w:r>
+        <w:rPr>
+          <w:rFonts w:ascii="Times New Roman" w:hAnsi="Times New Roman" w:cs="Times New Roman"/>
+          <w:b/>
+          <w:bCs/>
           <w:lang w:val="tr-TR"/>
         </w:rPr>
         <w:t xml:space="preserve">Görsel A:</w:t>
@@ -144,85 +118,59 @@
         <w:t xml:space="preserve"> Paslanmış tarihî bir top</w:t>
       </w:r>
     </w:p>
-    <w:tbl>
-      <w:tblPr>
-        <w:tblW w:w="9000" w:type="dxa"/>
+    <w:p>
+      <w:pPr>
         <w:jc w:val="center"/>
-        <w:tblBorders>
-          <w:top w:val="single" w:sz="8" w:space="0" w:color="7F7F7F"/>
-          <w:left w:val="single" w:sz="8" w:space="0" w:color="7F7F7F"/>
-          <w:bottom w:val="single" w:sz="8" w:space="0" w:color="7F7F7F"/>
-          <w:right w:val="single" w:sz="8" w:space="0" w:color="7F7F7F"/>
-        </w:tblBorders>
-      </w:tblPr>
-      <w:tblGrid>
-        <w:gridCol w:w="9000"/>
-      </w:tblGrid>
-      <w:tr>
-        <w:tc>
-          <w:tcPr>
-            <w:tcW w:w="9000" w:type="dxa"/>
-            <w:shd w:val="clear" w:color="auto" w:fill="EDEDED"/>
-          </w:tcPr>
-          <w:p>
-            <w:pPr>
-              <w:jc w:val="both"/>
-              <w:rPr>
-                <w:rFonts w:ascii="Times New Roman" w:hAnsi="Times New Roman" w:cs="Times New Roman"/>
-                <w:lang w:val="tr-TR"/>
-              </w:rPr>
-            </w:pPr>
-            <w:r>
-              <w:rPr>
-                <w:rFonts w:ascii="Times New Roman" w:hAnsi="Times New Roman" w:cs="Times New Roman"/>
-                <w:lang w:val="tr-TR"/>
-              </w:rPr>
-              <w:t xml:space="preserve">GÖRSEL ALANI (Shutterstock)</w:t>
-            </w:r>
-          </w:p>
-          <w:p>
-            <w:pPr>
-              <w:jc w:val="both"/>
-              <w:rPr>
-                <w:rFonts w:ascii="Times New Roman" w:hAnsi="Times New Roman" w:cs="Times New Roman"/>
-                <w:lang w:val="tr-TR"/>
-              </w:rPr>
-            </w:pPr>
-            <w:r>
-              <w:rPr>
-                <w:rFonts w:ascii="Times New Roman" w:hAnsi="Times New Roman" w:cs="Times New Roman"/>
-                <w:lang w:val="tr-TR"/>
-              </w:rPr>
-              <w:t xml:space="preserve">Tarif: Açık havadaki bronz bir heykelin yeşil renkli patina tabakasının yakın çekimi; tanınabilir bir kişiyi tasvir etmeyen bir heykel ya da süsleme tercih edilsin.</w:t>
-            </w:r>
-          </w:p>
-          <w:p>
-            <w:pPr>
-              <w:jc w:val="both"/>
-              <w:rPr>
-                <w:rFonts w:ascii="Times New Roman" w:hAnsi="Times New Roman" w:cs="Times New Roman"/>
-                <w:lang w:val="tr-TR"/>
-              </w:rPr>
-            </w:pPr>
-            <w:r>
-              <w:rPr>
-                <w:rFonts w:ascii="Times New Roman" w:hAnsi="Times New Roman" w:cs="Times New Roman"/>
-                <w:lang w:val="tr-TR"/>
-              </w:rPr>
-              <w:t xml:space="preserve">Shutter ID: 2847338501 (fotoğraf) — Verdigris (green patina) bronze griffin statue</w:t>
-            </w:r>
-          </w:p>
-        </w:tc>
-      </w:tr>
-    </w:tbl>
+      </w:pPr>
+      <w:r>
+        <w:drawing>
+          <wp:inline xmlns:a="http://schemas.openxmlformats.org/drawingml/2006/main" xmlns:pic="http://schemas.openxmlformats.org/drawingml/2006/picture">
+            <wp:extent cx="3991552" cy="2520000"/>
+            <wp:docPr id="900013" name="Picture 900013"/>
+            <wp:cNvGraphicFramePr>
+              <a:graphicFrameLocks noChangeAspect="1"/>
+            </wp:cNvGraphicFramePr>
+            <a:graphic>
+              <a:graphicData uri="http://schemas.openxmlformats.org/drawingml/2006/picture">
+                <pic:pic>
+                  <pic:nvPicPr>
+                    <pic:cNvPr id="0" name="2847338501_d.jpg"/>
+                    <pic:cNvPicPr/>
+                  </pic:nvPicPr>
+                  <pic:blipFill>
+                    <a:blip r:embed="rId12"/>
+                    <a:stretch>
+                      <a:fillRect/>
+                    </a:stretch>
+                  </pic:blipFill>
+                  <pic:spPr>
+                    <a:xfrm>
+                      <a:off x="0" y="0"/>
+                      <a:ext cx="3991552" cy="2520000"/>
+                    </a:xfrm>
+                    <a:prstGeom prst="rect"/>
+                  </pic:spPr>
+                </pic:pic>
+              </a:graphicData>
+            </a:graphic>
+          </wp:inline>
+        </w:drawing>
+      </w:r>
+    </w:p>
     <w:p>
       <w:pPr>
-        <w:jc w:val="both"/>
-        <w:rPr>
-          <w:rFonts w:ascii="Times New Roman" w:hAnsi="Times New Roman" w:cs="Times New Roman"/>
-          <w:lang w:val="tr-TR"/>
-        </w:rPr>
-      </w:pPr>
+        <w:jc w:val="center"/>
+      </w:pPr>
+      <w:r>
+        <w:rPr>
+          <w:rFonts w:ascii="Times New Roman" w:hAnsi="Times New Roman" w:cs="Times New Roman"/>
+          <w:b/>
+          <w:bCs/>
+          <w:highlight w:val="yellow"/>
+          <w:lang w:val="tr-TR"/>
+        </w:rPr>
+        <w:t xml:space="preserve">Shutter id: 2847338501</w:t>
+      </w:r>
     </w:p>
     <w:p>
       <w:pPr>

</xml_diff>